<commit_message>
Remove files not required for the submission
Drop the video script, evaluation console log, screenshot helper,
untested Docker files and the empty conftest; keep repo-only files
out of the submission archive.

Co-Authored-By: Claude Opus 5.5 <noreply@anthropic.com>
</commit_message>
<xml_diff>
--- a/Documentation/CS5_Technical_Report_Ayan_Mujawar_123B1B196.docx
+++ b/Documentation/CS5_Technical_Report_Ayan_Mujawar_123B1B196.docx
@@ -1210,7 +1210,7 @@
               <w:rPr>
                 <w:i w:val="0"/>
               </w:rPr>
-              <w:t>FastAPI (uvicorn) REST API: /ask, /validate-request, /generate-tests, /review, /export, /coverage. Streamlit UI with tabs for Q&amp;A, request validator, test generator, review queue, export and coverage. SQLite for test cases, approvals and audit log. Docker Compose (api, ui, ollama) planned.</w:t>
+              <w:t>FastAPI (uvicorn) REST API: /ask, /validate-request, /generate-tests, /review, /export, /coverage. Streamlit UI with tabs for Q&amp;A, request validator, test generator, review queue, export and coverage. SQLite for test cases, approvals and audit log.</w:t>
             </w:r>
           </w:p>
         </w:tc>
@@ -1382,7 +1382,7 @@
         <w:rPr>
           <w:i w:val="0"/>
         </w:rPr>
-        <w:t>Implemented in four increments, matching the case-study phases: (1) knowledge pilot — ingestion of the synthetic knowledge base into 151 structure-aware chunks, FAISS + BM25 indexes with reciprocal-rank fusion and cited Q&amp;A with an identifier guard, an out-of-scope guard and a citation guardrail; (2) test generation — a deterministic UDS rule engine (virtual BCM-X1), a scenario-planning prompt, guardrails, a coverage checklist and a DRAFT → APPROVED review workflow in SQLite; (3) automation — Jinja2 export of approved cases to Python (python-can + udsoncan) and CAPL; (4) a coverage view, evaluation script, 22 unit tests, FastAPI REST API and Docker Compose files (written, not executed).</w:t>
+        <w:t>Implemented in four increments, matching the case-study phases: (1) knowledge pilot — ingestion of the synthetic knowledge base into 151 structure-aware chunks, FAISS + BM25 indexes with reciprocal-rank fusion and cited Q&amp;A with an identifier guard, an out-of-scope guard and a citation guardrail; (2) test generation — a deterministic UDS rule engine (virtual BCM-X1), a scenario-planning prompt, guardrails, a coverage checklist and a DRAFT → APPROVED review workflow in SQLite; (3) automation — Jinja2 export of approved cases to Python (python-can + udsoncan) and CAPL; (4) a coverage view, evaluation script, 22 unit tests and a FastAPI REST API. Docker packaging is left as future work.</w:t>
       </w:r>
     </w:p>
     <w:p>
@@ -3000,7 +3000,7 @@
           <w:sz w:val="19"/>
           <w:szCs w:val="19"/>
         </w:rPr>
-        <w:t>Figures below are real screenshots of the running system (captured 23/10/2026 with Code/tools/capture_screenshots.py). Per-item logs: Evaluation_Results/run_20261023_122136/ (qa_results.csv, retrieval_results.csv, rule_engine_results.csv, generation_results.csv, sample_outputs.md) and the SQLite audit log.</w:t>
+        <w:t>Figures below are real screenshots of the running system (captured 23/10/2026). Per-item logs: Evaluation_Results/run_20261023_122136/ (qa_results.csv, retrieval_results.csv, rule_engine_results.csv, generation_results.csv, sample_outputs.md) and the SQLite audit log.</w:t>
       </w:r>
       <w:proofErr w:type="spellStart"/>
       <w:proofErr w:type="spellEnd"/>

</xml_diff>